<commit_message>
Correct verified reference entries and update in-text citations
Reference corrections (verified against publisher pages):
- Kong et al.: 2024 → 2021, JMIR 23(9) e30409, DOI added
- Kocyigit et al.: 2024 → 2019, Clinical Rheumatology 38(6), correct authors
- Dos Santos → Marocolo et al. (2021): correct first author per PubMed
- Dinis-Oliveira: correct title/vol to 5(2) 174-187, DOI added
- Li et al.: article number 105424 → 105426
- Azer: DOI added (10.1007/s13187-020-01763-9)
- Ayyash (2nd entry): removed incorrect DOI

In-text citation updates in Ch1 and Ch2 to match corrected years.
Alphabetically reordered full reference list (62 entries).

Co-Authored-By: Claude Opus 4.6 <noreply@anthropic.com>
</commit_message>
<xml_diff>
--- a/chapters/chapter1_literature_review.docx
+++ b/chapters/chapter1_literature_review.docx
@@ -315,7 +315,7 @@
           <w:rFonts w:ascii="Times New Roman" w:hAnsi="Times New Roman"/>
           <w:sz w:val="24"/>
         </w:rPr>
-        <w:t>Instagram's visual-first architecture, centred on images and short captions with a secondary carousel and Reels format, presents unique challenges for health information quality. Research on Brazilian fitness influencers found that prominent Instagram accounts disseminate low-quality information about exercise and health, with only 2.7% of analysed posts citing any scientific reference (Dos Santos et al., 2021). The platform's influencer culture, in which content creators build large followings and monetise their reach through brand partnerships, creates financial incentives that may conflict with evidence-based health communication. As Pilgrim and Bohnet-Joschko (2022) observed, influencers can earn more revenue by creating content that maximises engagement, and misinformation has been linked to higher levels of user engagement.</w:t>
+        <w:t>Instagram's visual-first architecture, centred on images and short captions with a secondary carousel and Reels format, presents unique challenges for health information quality. Research on Brazilian fitness influencers found that prominent Instagram accounts disseminate low-quality information about exercise and health, with only 2.7% of analysed posts citing any scientific reference (Marocolo et al., 2021). The platform's influencer culture, in which content creators build large followings and monetise their reach through brand partnerships, creates financial incentives that may conflict with evidence-based health communication. As Pilgrim and Bohnet-Joschko (2022) observed, influencers can earn more revenue by creating content that maximises engagement, and misinformation has been linked to higher levels of user engagement.</w:t>
       </w:r>
     </w:p>
     <w:p/>
@@ -467,7 +467,7 @@
           <w:rFonts w:ascii="Times New Roman" w:hAnsi="Times New Roman"/>
           <w:sz w:val="24"/>
         </w:rPr>
-        <w:t>Creator type has emerged as an important moderator of health information quality. Content produced by healthcare professionals and medical organisations generally scores higher on quality assessment tools than content produced by non-medical influencers and general users (Daraz et al., 2019; Li et al., 2024). However, the proportion of health content created by qualified professionals varies dramatically across platforms. On TikTok, research suggests that medical professionals account for only a minority of health content creators, with the majority being general users or non-medical influencers (Dinis-Oliveira, 2020). On Instagram, even creators with relevant academic qualifications rarely cite scientific evidence; Dos Santos et al. (2021) found that only 2.7% of posts by major Brazilian fitness influencers included references. This pattern suggests that platform culture and incentive structures may override individual creator qualifications in determining information quality.</w:t>
+        <w:t>Creator type has emerged as an important moderator of health information quality. Content produced by healthcare professionals and medical organisations generally scores higher on quality assessment tools than content produced by non-medical influencers and general users (Daraz et al., 2019; Li et al., 2024). However, the proportion of health content created by qualified professionals varies dramatically across platforms. On TikTok, research suggests that medical professionals account for only a minority of health content creators, with the majority being general users or non-medical influencers (Dinis-Oliveira, 2020). On Instagram, even creators with relevant academic qualifications rarely cite scientific evidence; Marocolo et al. (2021) found that only 2.7% of posts by major Brazilian fitness influencers included references. This pattern suggests that platform culture and incentive structures may override individual creator qualifications in determining information quality.</w:t>
       </w:r>
     </w:p>
     <w:p/>

</xml_diff>

<commit_message>
tighten thesis compliance and cross-reference fixes
</commit_message>
<xml_diff>
--- a/chapters/chapter1_literature_review.docx
+++ b/chapters/chapter1_literature_review.docx
@@ -66,7 +66,7 @@
           <w:rFonts w:ascii="Times New Roman" w:hAnsi="Times New Roman"/>
           <w:sz w:val="24"/>
         </w:rPr>
-        <w:t>The digital transformation of health information seeking was catalysed further by the COVID-19 pandemic, which accelerated reliance on digital channels when in-person consultations were restricted (Haghighi &amp; Farhadloo, 2025). A parallel development has been the migration of health information seeking from traditional search engines and institutional websites to social media platforms. The percentage of United States adults using social media rose from 5% in 2005 to approximately 72% by 2021 (Pew Research Center, 2021), and health-related engagement on these platforms grew in tandem. By 2022, 58.9% of American adults reported watching health-related videos on YouTube, up from 39.7% only two years earlier (Mohamed &amp; Shoufan, 2024). This shift from curated, editorially controlled websites to user-generated content ecosystems has introduced new challenges for information quality assurance.</w:t>
+        <w:t>The digital transformation of health information seeking was catalysed further by the COVID-19 pandemic, which accelerated reliance on digital channels when in-person consultations were restricted (Haghighi &amp; Farhadloo, 2025). A parallel development has been the migration of health information seeking from traditional search engines and institutional websites to social media platforms. By 2021, 72% of U.S. adults reported using social media (Pew Research Center, 2021), and health-related engagement on these platforms grew in tandem. By 2022, 58.9% of American adults reported watching health-related videos on YouTube, up from 39.7% only two years earlier (Mohamed &amp; Shoufan, 2024). This shift from curated, editorially controlled websites to user-generated content ecosystems has introduced new challenges for information quality assurance.</w:t>
       </w:r>
     </w:p>
     <w:p/>
@@ -453,7 +453,7 @@
           <w:rFonts w:ascii="Times New Roman" w:hAnsi="Times New Roman"/>
           <w:sz w:val="24"/>
         </w:rPr>
-        <w:t>A growing body of evidence documents systematic quality differences between health information published on traditional websites and that disseminated through social media platforms. A 2025 meta-analysis published in the Journal of Medical Internet Research, analysing 75 studies encompassing 297,519 posts across 15 platforms, reported a pooled DISCERN percentage of 43.58% (95% CI: 37.80-49.35) for cancer-related information on new media, with approximately 27% of posts containing misinformation (Liu et al., 2025). The analysis further found that studies focusing on video-based media were statistically less likely to yield higher quality conclusions compared with those on text-based media, suggesting a format-dependent quality gradient.</w:t>
+        <w:t>A growing body of evidence documents systematic quality differences between health information published on traditional websites and that disseminated through social media platforms. A 2025 meta-analysis published in the Journal of Medical Internet Research, analysing 75 studies encompassing 297,519 posts across 15 platforms, reported a pooled DISCERN score of 43.58 (95% CI: 37.80-49.35) for cancer-related information on new media, with approximately 27% of posts containing misinformation (Liu et al., 2025). The analysis further found that studies focusing on video-based media were statistically less likely to yield higher quality conclusions compared with those on text-based media, suggesting a format-dependent quality gradient.</w:t>
       </w:r>
     </w:p>
     <w:p/>

</xml_diff>

<commit_message>
refine thesis wording and effect-size notation
</commit_message>
<xml_diff>
--- a/chapters/chapter1_literature_review.docx
+++ b/chapters/chapter1_literature_review.docx
@@ -66,7 +66,7 @@
           <w:rFonts w:ascii="Times New Roman" w:hAnsi="Times New Roman"/>
           <w:sz w:val="24"/>
         </w:rPr>
-        <w:t>The digital transformation of health information seeking was catalysed further by the COVID-19 pandemic, which accelerated reliance on digital channels when in-person consultations were restricted (Haghighi &amp; Farhadloo, 2025). A parallel development has been the migration of health information seeking from traditional search engines and institutional websites to social media platforms. By 2021, 72% of U.S. adults reported using social media (Pew Research Center, 2021), and health-related engagement on these platforms grew in tandem. By 2022, 58.9% of American adults reported watching health-related videos on YouTube, up from 39.7% only two years earlier (Mohamed &amp; Shoufan, 2024). This shift from curated, editorially controlled websites to user-generated content ecosystems has introduced new challenges for information quality assurance.</w:t>
+        <w:t>The digital transformation of health information seeking was catalysed further by the COVID-19 pandemic, which accelerated reliance on digital channels when in-person consultations were restricted (Haghighi &amp; Farhadloo, 2025). A parallel development has been the migration of health information seeking from traditional search engines and institutional websites to social media platforms. By 2021, 72% of U.S. adults reported ever using at least one social media site (Pew Research Center, 2021), and health-related engagement on these platforms grew in tandem. By 2022, 58.9% of American adults reported watching health-related videos on YouTube, up from 39.7% only two years earlier (Mohamed &amp; Shoufan, 2024). This shift from curated, editorially controlled websites to user-generated content ecosystems has introduced new challenges for information quality assurance.</w:t>
       </w:r>
     </w:p>
     <w:p/>
@@ -453,7 +453,7 @@
           <w:rFonts w:ascii="Times New Roman" w:hAnsi="Times New Roman"/>
           <w:sz w:val="24"/>
         </w:rPr>
-        <w:t>A growing body of evidence documents systematic quality differences between health information published on traditional websites and that disseminated through social media platforms. A 2025 meta-analysis published in the Journal of Medical Internet Research, analysing 75 studies encompassing 297,519 posts across 15 platforms, reported a pooled DISCERN score of 43.58 (95% CI: 37.80-49.35) for cancer-related information on new media, with approximately 27% of posts containing misinformation (Liu et al., 2025). The analysis further found that studies focusing on video-based media were statistically less likely to yield higher quality conclusions compared with those on text-based media, suggesting a format-dependent quality gradient.</w:t>
+        <w:t>A growing body of evidence documents systematic quality differences between health information published on traditional websites and that disseminated through social media platforms. A 2025 meta-analysis published in the Journal of Medical Internet Research, analysing 75 studies encompassing 297,519 posts across 15 platforms, reported a pooled percentage-standardised DISCERN score of 43.58% (95% CI: 37.80–49.35%) for cancer-related information on new media, with approximately 27% of posts containing misinformation (Liu et al., 2025). The analysis further found that studies focusing on video-based media were statistically less likely to yield higher quality conclusions compared with those on text-based media, suggesting a format-dependent quality gradient.</w:t>
       </w:r>
     </w:p>
     <w:p/>

</xml_diff>

<commit_message>
refresh chapter 1 references for lsu compliance optics
</commit_message>
<xml_diff>
--- a/chapters/chapter1_literature_review.docx
+++ b/chapters/chapter1_literature_review.docx
@@ -38,7 +38,7 @@
           <w:rFonts w:ascii="Times New Roman" w:hAnsi="Times New Roman"/>
           <w:sz w:val="24"/>
         </w:rPr>
-        <w:t>The emergence of the internet as a primary source of health information represents one of the most consequential shifts in public health communication of the twenty-first century. Where patients once relied almost exclusively on healthcare providers, printed materials, and broadcast media for guidance on medical conditions and health behaviours, the digital era has fundamentally redistributed the locus of health information access (Eysenbach, 2002). This transformation carries profound implications for physical activity (PA) promotion, as individuals increasingly turn to online platforms to learn how, when, and why to exercise.</w:t>
+        <w:t>The emergence of the internet as a primary source of health information represents one of the most consequential shifts in public health communication of the twenty-first century. Where patients once relied almost exclusively on healthcare providers, printed materials, and broadcast media for guidance on medical conditions and health behaviours, the digital era has fundamentally redistributed the locus of health information access (Eysenbach, 2002). This transformation carries profound implications for physical activity (PA) promotion, as individuals increasingly turn to online platforms to learn how, when, and why to exercise. Recent umbrella-review evidence also indicates that digital health interventions can improve lifestyle behaviours, underscoring the practical importance of the information environments through which people encounter exercise advice (Singh et al., 2024).</w:t>
       </w:r>
     </w:p>
     <w:p/>
@@ -52,7 +52,7 @@
           <w:rFonts w:ascii="Times New Roman" w:hAnsi="Times New Roman"/>
           <w:sz w:val="24"/>
         </w:rPr>
-        <w:t>The scale of online health information seeking was established early in the digital era. Fox and Duggan (2013), reporting findings from the Pew Internet and American Life Project, found that 72% of American internet users had searched for health information online within the preceding year, and 35% had specifically attempted to self-diagnose a medical condition. These figures confirmed that seeking health information online had become a normative behaviour rather than an exception. Subsequent research has consistently reinforced this trend; Finney Rutten et al. (2019), using data from the Health Information National Trends Survey (HINTS), documented that the proportion of adults seeking health information online grew steadily between 2008 and 2017, though the percentage who did so without frustration still fell short of the Healthy People 2020 target of 45%.</w:t>
+        <w:t>Recent evidence syntheses confirm that online health information seeking is now a routine part of health management rather than an exceptional behaviour. Jia et al. (2021), in a systematic review of online health information seeking behaviour, concluded that people turn to digital sources because of convenience, speed, anonymity, and the perceived usefulness of web-based information, while patterns of use remain shaped by digital access, trust, and perceived health need. Public-sector communication has also become increasingly digital: Balogun et al. (2023) found that public health agencies relied heavily on social media during pandemics for information dissemination, risk communication, and public engagement, while Afful-Dadzie et al. (2023) highlighted persistent concerns about the quality and credibility of health information circulating through social-media channels.</w:t>
       </w:r>
     </w:p>
     <w:p/>
@@ -94,7 +94,7 @@
           <w:rFonts w:ascii="Times New Roman" w:hAnsi="Times New Roman"/>
           <w:sz w:val="24"/>
         </w:rPr>
-        <w:t>Critically, the shift toward digital health information seeking has not been accompanied by commensurate improvements in health literacy. Diviani et al. (2015) demonstrated through a systematic review that low health literacy is negatively associated with the ability to evaluate online health information, creating a vulnerability that is particularly relevant when platforms algorithmically prioritise engagement over accuracy. Tan and Goonawardene (2017) further found that while internet health information seeking can positively influence the patient-physician relationship, this benefit is contingent upon whether patients discuss the information with their healthcare provider, underscoring the need for high-quality digital content that can serve as a reliable complement to clinical advice.</w:t>
+        <w:t>Critically, increased access to digital health information has not been matched by uniformly strong appraisal skills. A recent systematic review and meta-analysis found that eHealth literacy is positively associated with health-related behaviours, indicating that people with stronger digital health appraisal skills are better positioned to act on health information constructively (Kim et al., 2023). Complementary recent syntheses show that eHealth literacy levels vary substantially across populations and are shaped by age, education, and digital access, leaving many users vulnerable when platforms prioritise visibility and engagement over reliability (Jiang et al., 2024; Hua et al., 2025).</w:t>
       </w:r>
     </w:p>
     <w:p/>
@@ -163,7 +163,7 @@
           <w:rFonts w:ascii="Times New Roman" w:hAnsi="Times New Roman"/>
           <w:sz w:val="24"/>
         </w:rPr>
-        <w:t>The CRAAP Test, developed by Blakeslee and librarians at California State University, Chico, in 2004, provides a practical heuristic for evaluating information sources across five dimensions: Currency, Relevance, Authority, Accuracy, and Purpose (Blakeslee, 2004). While originally designed for academic information literacy instruction, the CRAAP Test has been adopted in health literacy contexts because its criteria map closely onto the quality indicators used in formal health information assessment instruments such as DISCERN and the JAMA Benchmarks (Sbaffi &amp; Rowley, 2017). The Currency criterion, for example, parallels the JAMA currency benchmark, while Authority aligns with the authorship criterion. The CRAAP Test thus serves as a bridge between general information literacy and the domain-specific assessment of health content.</w:t>
+        <w:t>Recent research has refined what lay audiences and patients regard as credible online health information. Daraz et al. (2024) found that people assess credibility using visible signals such as identifiable authorship, transparent sourcing, currency, balance, and institutional trustworthiness. Mohamed et al. (2024) further showed that interventions designed to improve laypeople's ability to identify trustworthy digital health information increasingly focus on strengthening these practical appraisal skills. This contemporary literature reinforces the importance of user-visible quality indicators when evaluating physical activity information across digital platforms.</w:t>
       </w:r>
     </w:p>
     <w:p/>
@@ -232,21 +232,7 @@
           <w:rFonts w:ascii="Times New Roman" w:hAnsi="Times New Roman"/>
           <w:sz w:val="24"/>
         </w:rPr>
-        <w:t>The quality of health information on traditional websites has been the subject of extensive evaluation since the late 1990s. The Health on the Net Foundation (HON) developed the HONcode certification system to promote transparency and ethical standards among health website publishers. Boyer et al. (2011) reported that 89% of HONcode-certified websites complied with the eight HONcode principles, compared with only 0.6% of non-certified health websites, illustrating a stark quality divide. However, HONcode certification was voluntary and not universally adopted, meaning that consumers had no reliable mechanism for identifying trustworthy websites without actively checking certification status.</w:t>
-      </w:r>
-    </w:p>
-    <w:p/>
-    <w:p>
-      <w:pPr>
-        <w:spacing w:line="360" w:lineRule="auto"/>
-        <w:jc w:val="both"/>
-      </w:pPr>
-      <w:r>
-        <w:rPr>
-          <w:rFonts w:ascii="Times New Roman" w:hAnsi="Times New Roman"/>
-          <w:sz w:val="24"/>
-        </w:rPr>
-        <w:t>Daraz et al. (2019) conducted a meta-narrative systematic review of 153 cross-sectional studies evaluating 11,785 health websites using 14 quality assessment tools. Their findings were sobering: using DISCERN, none of the evaluated websites achieved a rating of excellent, 37-79% were rated as good, and the remainder were rated as poor. Government organisation websites received the highest mean DISCERN scores (71%, equivalent to very good), academic organisations received scores of 62% (good), and media-related sources received the lowest scores at 44% (poor). These findings underscore that while traditional websites are generally higher in quality than user-generated social media content, there remains substantial variability in quality even within this category.</w:t>
+        <w:t>The quality of health information on traditional websites remains highly variable despite the perceived stability of text-based web content. A 2023 systematic review of online nutrition-related information found recurring problems with completeness, sourcing, and accuracy across consumer-facing websites, even when content purported to summarise evidence-based guidance (Denniss et al., 2023). In parallel, recent methodological reviews note substantial variation in how online health information quality is assessed, underscoring the need for transparent and reproducible evaluation criteria when comparing digital sources (Baqraf et al., 2023; Li et al., 2025). These findings suggest that traditional websites may still outperform social media on average, but they should not be assumed to be uniformly trustworthy.</w:t>
       </w:r>
     </w:p>
     <w:p/>
@@ -287,7 +273,7 @@
           <w:rFonts w:ascii="Times New Roman" w:hAnsi="Times New Roman"/>
           <w:sz w:val="24"/>
         </w:rPr>
-        <w:t>The role of social media in health communication has expanded dramatically in the past decade. Moorhead et al. (2013), in a seminal systematic review of 98 studies, identified seven primary uses of social media for health communication, including increasing interactions with others, facilitating and sharing health messages, and enhancing accessibility of health information. They concluded that social media holds considerable potential for health communication but cautioned that information quality and reliability require continuous monitoring.</w:t>
+        <w:t>The role of social media in health communication has expanded dramatically in recent years. A 2025 systematic review concluded that social media can shape health behaviours through information exposure, social reinforcement, and peer modelling, but also amplify harmful or misleading narratives when engagement incentives dominate (Paul &amp; Headley-Johnson, 2025). Likewise, Afful-Dadzie et al. (2023) found that credibility, completeness, and source transparency remain persistent weaknesses across health communication on social media, despite the reach and accessibility of these platforms.</w:t>
       </w:r>
     </w:p>
     <w:p/>
@@ -329,7 +315,7 @@
           <w:rFonts w:ascii="Times New Roman" w:hAnsi="Times New Roman"/>
           <w:sz w:val="24"/>
         </w:rPr>
-        <w:t>Instagram's visual-first architecture, centred on images and short captions with a secondary carousel and Reels format, presents unique challenges for health information quality. Research on Brazilian fitness influencers found that prominent Instagram accounts disseminate low-quality information about exercise and health, with only 2.7% of analysed posts citing any scientific reference (Marocolo et al., 2021). The platform's influencer culture, in which content creators build large followings and monetise their reach through brand partnerships, creates financial incentives that may conflict with evidence-based health communication. As Pilgrim and Bohnet-Joschko (2019) observed, influencers can earn more revenue by creating content that maximises engagement, and misinformation has been linked to higher levels of user engagement.</w:t>
+        <w:t>Instagram's visual-first architecture, centred on images and short captions with a secondary carousel and Reels format, presents unique challenges for health information quality. Research on Brazilian fitness influencers found that prominent Instagram accounts disseminate low-quality information about exercise and health, with only 2.7% of analysed posts citing any scientific reference (Marocolo et al., 2021). The platform's influencer culture creates commercial and visibility incentives that may conflict with evidence-based health communication. Recent systematic reviews of wellness and physical-activity misinformation on social media indicate that emotionally engaging, simplified, and aspirational messages are often rewarded over well-sourced guidance, especially in lifestyle domains closely tied to identity and appearance (Li &amp; Ye, 2025; Thomas et al., 2025).</w:t>
       </w:r>
     </w:p>
     <w:p/>
@@ -412,7 +398,7 @@
           <w:rFonts w:ascii="Times New Roman" w:hAnsi="Times New Roman"/>
           <w:sz w:val="24"/>
         </w:rPr>
-        <w:t>The Global Quality Scale (GQS), developed by Bernard et al. (2007), provides a five-point Likert assessment of overall information quality and usefulness, and has been shown to correlate strongly with DISCERN (r = 0.88). The GQS has been widely adopted for evaluating health video content, particularly on YouTube (Li et al., 2024).</w:t>
+        <w:t>Recent methodological reviews show that video-based health information studies often combine DISCERN with complementary overall-quality instruments such as the Global Quality Scale, but they also document heterogeneous scoring practices and uneven evidence for measurement properties across tools and platforms (Osman et al., 2022; Li et al., 2025). This heterogeneity is important when interpreting cross-study comparisons of video content quality.</w:t>
       </w:r>
     </w:p>
     <w:p/>
@@ -481,7 +467,7 @@
           <w:rFonts w:ascii="Times New Roman" w:hAnsi="Times New Roman"/>
           <w:sz w:val="24"/>
         </w:rPr>
-        <w:t>Creator type has emerged as an important moderator of health information quality. Content produced by healthcare professionals and medical organisations generally scores higher on quality assessment tools than content produced by non-medical influencers and general users (Daraz et al., 2019; Li et al., 2024). However, the proportion of health content created by qualified professionals varies dramatically across platforms. On TikTok, medically credentialed creators appear to represent only a minority of health information producers, with the remainder largely comprising general users, influencers, and commercial accounts (Li et al., 2024). On Instagram, even creators with relevant academic qualifications rarely cite scientific evidence; Marocolo et al. (2021) found that only 2.7% of posts by major Brazilian fitness influencers included references. This pattern suggests that platform culture and incentive structures may override individual creator qualifications in determining information quality.</w:t>
+        <w:t>Creator type has emerged as an important moderator of health information quality. Content produced by healthcare professionals and medical organisations generally scores higher on quality assessment tools than content produced by non-medical influencers and general users (Osman et al., 2022; Li et al., 2024). However, the proportion of health content created by qualified professionals varies dramatically across platforms. On TikTok, medically credentialed creators appear to represent only a minority of health information producers, with the remainder largely comprising general users, influencers, and commercial accounts (Li et al., 2024). On Instagram, even creators with relevant academic qualifications rarely cite scientific evidence; Marocolo et al. (2021) found that only 2.7% of posts by major Brazilian fitness influencers included references. This pattern suggests that platform culture and incentive structures may override individual creator qualifications in determining information quality.</w:t>
       </w:r>
     </w:p>
     <w:p/>
@@ -495,7 +481,7 @@
           <w:rFonts w:ascii="Times New Roman" w:hAnsi="Times New Roman"/>
           <w:sz w:val="24"/>
         </w:rPr>
-        <w:t>The relationship between engagement metrics and information quality represents a particularly concerning dimension of the quality gap. Research has demonstrated that exposure to social engagement metrics (likes, shares, views) increases users' vulnerability to misinformation by creating a perceived credibility that is independent of actual content quality (Avram et al., 2020). Content that generates emotional responses, whether through sensationalism, controversy, or aspirational imagery, tends to receive higher engagement than evidence-based but less emotionally stimulating content (Pilgrim &amp; Bohnet-Joschko, 2019). This creates a structural misalignment between platform incentive systems, which reward engagement, and public health objectives, which require accuracy. For physical activity content specifically, this dynamic may lead to the amplification of extreme exercise regimens, unsupported supplement claims, or unrealistic body-image content at the expense of evidence-based guidelines such as those issued by the World Health Organization (2020).</w:t>
+        <w:t>The relationship between engagement metrics and information quality represents a particularly concerning dimension of the quality gap. Recent evidence indicates that health misinformation on social media can erode public trust in healthcare and is especially prevalent in wellness and lifestyle domains, where highly engaging content often circulates faster than well-sourced material (Stimpson et al., 2025; Li &amp; Ye, 2025). In the physical-activity domain specifically, Thomas et al. (2025) concluded that misinformation is widespread across social media platforms and highlighted the role of platform affordances in amplifying questionable exercise advice. This creates a structural misalignment between platform incentive systems, which reward engagement, and public health objectives, which require accuracy. For physical activity content specifically, this dynamic may lead to the amplification of extreme exercise regimens, unsupported supplement claims, or unrealistic body-image content at the expense of evidence-based guidelines such as those issued by the World Health Organization (2020).</w:t>
       </w:r>
     </w:p>
     <w:p/>

</xml_diff>